<commit_message>
Move interpretive/schematic figures to supplementary (5 main + 6 supp)
Co-Authored-By: Tatsuki Onishi <bougtoir@gmail.com>
</commit_message>
<xml_diff>
--- a/denisovan-archaic-dna-analysis/docs/ajhb_submission/manuscript_ajhb.docx
+++ b/denisovan-archaic-dna-analysis/docs/ajhb_submission/manuscript_ajhb.docx
@@ -462,27 +462,6 @@
         <w:pStyle w:val="Heading2"/>
       </w:pPr>
       <w:r>
-        <w:t>Schematic dispersal context</w:t>
-      </w:r>
-    </w:p>
-    <w:p>
-      <w:pPr>
-        <w:ind w:firstLine="432"/>
-      </w:pPr>
-      <w:r>
-        <w:rPr>
-          <w:rFonts w:ascii="Times New Roman" w:hAnsi="Times New Roman"/>
-          <w:i w:val="0"/>
-          <w:sz w:val="24"/>
-        </w:rPr>
-        <w:t>A Minard-style diagram places the analysis within broad dispersal and archaic-introgression contexts (Figure 3). Band widths, branch positions, and event placement are schematic and are not estimates from the present pairwise analysis.</w:t>
-      </w:r>
-    </w:p>
-    <w:p>
-      <w:pPr>
-        <w:pStyle w:val="Heading2"/>
-      </w:pPr>
-      <w:r>
         <w:t>Robustness analyses</w:t>
       </w:r>
     </w:p>
@@ -496,7 +475,7 @@
           <w:i w:val="0"/>
           <w:sz w:val="24"/>
         </w:rPr>
-        <w:t>Negative distance correlations were examined across admixture exclusions, within-dataset subsets, minimum sample sizes, and regional omissions. Figure 4 shows the effect of excluding designated recently admixed populations, and Figure 5 shows window-size results at 250 kb, 500 kb, and 1 Mb. These analyses were treated as robustness checks rather than independent confirmatory tests.</w:t>
+        <w:t>Negative distance correlations were examined across admixture exclusions, within-dataset subsets, minimum sample sizes, and regional omissions. Figure 3 shows the effect of excluding designated recently admixed populations, and Figure 4 shows window-size results at 250 kb, 500 kb, and 1 Mb. These analyses were treated as robustness checks rather than independent confirmatory tests.</w:t>
       </w:r>
     </w:p>
     <w:p>
@@ -538,7 +517,7 @@
           <w:i w:val="0"/>
           <w:sz w:val="24"/>
         </w:rPr>
-        <w:t>The 500-kb ABO-centered scan identified 834 Neanderthal or Both source segments, of which 129 overlapped the ABO gene. Of the 834 interval segments, 335 had tied maximum reference similarity and were not forced to a lineage. In the Indigenous American HGDP subset, one Pima segment overlapped ABO and one Maya segment lay downstream within the wider interval. Both were Vindija-closest, but two segments among 41 represented individuals do not support a regional proportion or migration-route inference (Figure 6; Table 2).</w:t>
+        <w:t>The 500-kb ABO-centered scan identified 834 Neanderthal or Both source segments, of which 129 overlapped the ABO gene. Of the 834 interval segments, 335 had tied maximum reference similarity and were not forced to a lineage. In the Indigenous American HGDP subset, one Pima segment overlapped ABO and one Maya segment lay downstream within the wider interval. Both were Vindija-closest, but two segments among 41 represented individuals do not support a regional proportion or migration-route inference (Figure 5; Table 2).</w:t>
       </w:r>
     </w:p>
     <w:p>
@@ -546,7 +525,7 @@
         <w:pStyle w:val="Heading2"/>
       </w:pPr>
       <w:r>
-        <w:t>ABO-related and global contextual figures</w:t>
+        <w:t>Contextual and schematic displays</w:t>
       </w:r>
     </w:p>
     <w:p>
@@ -559,7 +538,7 @@
           <w:i w:val="0"/>
           <w:sz w:val="24"/>
         </w:rPr>
-        <w:t>The O2-defining allele and ABO-window carrier summaries use different sources and are displayed descriptively rather than as an association analysis (Figure 7). The Ancient North Eurasian pathway is retained as a testable contextual hypothesis, not a route inferred from the two Indigenous American segment records (Figure 8). Ancient and modern ABO-window observations were produced by different pipelines and permit no formal temporal comparison (Figure 9). A literature-derived global bivariate map provides broad Neanderthal and Denisovan ancestry context; its approximate values were not used in the statistical models (Figure 10).</w:t>
+        <w:t>Several contextual and schematic displays are provided as supplementary figures because they do not derive from the pairwise analysis. A Minard-style schematic places the analysis within broad dispersal and archaic-introgression contexts, with illustrative band widths and event placement (Figure S2). The O2-defining allele and ABO-window carrier summaries use different sources and are displayed descriptively rather than as an association analysis (Figure S3). An Ancient North Eurasian pathway is retained as a testable contextual hypothesis, not a route inferred from the two Indigenous American segment records (Figure S4). Ancient and modern ABO-window observations were produced by different pipelines and permit no formal temporal comparison (Figure S5). A literature-derived global bivariate map provides broad Neanderthal and Denisovan ancestry context; its approximate values were not used in the statistical models (Figure S6).</w:t>
       </w:r>
     </w:p>
     <w:p>
@@ -1095,7 +1074,7 @@
         <w:t xml:space="preserve">Figure 3. </w:t>
       </w:r>
       <w:r>
-        <w:t>Minard-style schematic of human dispersal and archaic introgression. Band widths, branch positions, and event placement are illustrative and do not estimate migration magnitude, ancestry proportion, or a route supported by the present analysis.</w:t>
+        <w:t>Sensitivity of the descriptive Neanderthal distance correlation to exclusion of designated recently admixed populations.</w:t>
       </w:r>
     </w:p>
     <w:p>
@@ -1109,7 +1088,7 @@
         <w:t xml:space="preserve">Figure 4. </w:t>
       </w:r>
       <w:r>
-        <w:t>Sensitivity of the descriptive Neanderthal distance correlation to exclusion of designated recently admixed populations.</w:t>
+        <w:t>Descriptive geographic distance correlations at 250-kb, 500-kb, and 1-Mb window sizes. Quadratic assignment procedure results are tabulated in Supplementary Data.</w:t>
       </w:r>
     </w:p>
     <w:p>
@@ -1123,77 +1102,7 @@
         <w:t xml:space="preserve">Figure 5. </w:t>
       </w:r>
       <w:r>
-        <w:t>Descriptive geographic distance correlations at 250-kb, 500-kb, and 1-Mb window sizes. Quadratic assignment procedure results are tabulated in Supplementary Data.</w:t>
-      </w:r>
-    </w:p>
-    <w:p>
-      <w:pPr>
-        <w:spacing w:line="360" w:lineRule="auto" w:after="160"/>
-      </w:pPr>
-      <w:r>
-        <w:rPr>
-          <w:b/>
-        </w:rPr>
-        <w:t xml:space="preserve">Figure 6. </w:t>
-      </w:r>
-      <w:r>
         <w:t>ABO-centered analysis preserving the historical grouped-bar and segment-map layout. Equal maximum-similarity ties are excluded from the displayed three-reference proportions and retained in Supplementary Data. The Pima segment overlaps ABO; the Maya segment is within the wider interval but does not overlap the gene. Counts are segments, not regional frequencies.</w:t>
-      </w:r>
-    </w:p>
-    <w:p>
-      <w:pPr>
-        <w:spacing w:line="360" w:lineRule="auto" w:after="160"/>
-      </w:pPr>
-      <w:r>
-        <w:rPr>
-          <w:b/>
-        </w:rPr>
-        <w:t xml:space="preserve">Figure 7. </w:t>
-      </w:r>
-      <w:r>
-        <w:t>O2 blood-group subtype-defining allele frequencies and ABO-window segment-carrier frequencies. The panels use different sources and are not an association analysis; proximity does not establish that the O2 allele is Neanderthal-derived.</w:t>
-      </w:r>
-    </w:p>
-    <w:p>
-      <w:pPr>
-        <w:spacing w:line="360" w:lineRule="auto" w:after="160"/>
-      </w:pPr>
-      <w:r>
-        <w:rPr>
-          <w:b/>
-        </w:rPr>
-        <w:t xml:space="preserve">Figure 8. </w:t>
-      </w:r>
-      <w:r>
-        <w:t>Ancient North Eurasian contextual hypothesis. Dashed arrows represent a testable narrative, not evidence that either observed segment followed the illustrated route.</w:t>
-      </w:r>
-    </w:p>
-    <w:p>
-      <w:pPr>
-        <w:spacing w:line="360" w:lineRule="auto" w:after="160"/>
-      </w:pPr>
-      <w:r>
-        <w:rPr>
-          <w:b/>
-        </w:rPr>
-        <w:t xml:space="preserve">Figure 9. </w:t>
-      </w:r>
-      <w:r>
-        <w:t>Descriptive ancient and modern ABO-window summaries generated by different pipelines; no formal temporal comparison is made.</w:t>
-      </w:r>
-    </w:p>
-    <w:p>
-      <w:pPr>
-        <w:spacing w:line="360" w:lineRule="auto" w:after="160"/>
-      </w:pPr>
-      <w:r>
-        <w:rPr>
-          <w:b/>
-        </w:rPr>
-        <w:t xml:space="preserve">Figure 10. </w:t>
-      </w:r>
-      <w:r>
-        <w:t>Literature-derived global context. Circle size represents approximate Neanderthal ancestry and color intensity represents approximate Denisovan ancestry. Values were not used in the pairwise statistical models.</w:t>
       </w:r>
     </w:p>
     <w:p>
@@ -1216,6 +1125,76 @@
       </w:r>
       <w:r>
         <w:t>Complete 66-population Neanderthal and Denisovan profile-similarity matrices.</w:t>
+      </w:r>
+    </w:p>
+    <w:p>
+      <w:pPr>
+        <w:spacing w:line="360" w:lineRule="auto" w:after="160"/>
+      </w:pPr>
+      <w:r>
+        <w:rPr>
+          <w:b/>
+        </w:rPr>
+        <w:t xml:space="preserve">Figure S2. </w:t>
+      </w:r>
+      <w:r>
+        <w:t>Minard-style schematic of human dispersal and archaic introgression. Band widths, branch positions, and event placement are illustrative and do not estimate migration magnitude, ancestry proportion, or a route supported by the present analysis.</w:t>
+      </w:r>
+    </w:p>
+    <w:p>
+      <w:pPr>
+        <w:spacing w:line="360" w:lineRule="auto" w:after="160"/>
+      </w:pPr>
+      <w:r>
+        <w:rPr>
+          <w:b/>
+        </w:rPr>
+        <w:t xml:space="preserve">Figure S3. </w:t>
+      </w:r>
+      <w:r>
+        <w:t>O2 blood-group subtype-defining allele frequencies and ABO-window segment-carrier frequencies. The panels use different sources and are not an association analysis; proximity does not establish that the O2 allele is Neanderthal-derived.</w:t>
+      </w:r>
+    </w:p>
+    <w:p>
+      <w:pPr>
+        <w:spacing w:line="360" w:lineRule="auto" w:after="160"/>
+      </w:pPr>
+      <w:r>
+        <w:rPr>
+          <w:b/>
+        </w:rPr>
+        <w:t xml:space="preserve">Figure S4. </w:t>
+      </w:r>
+      <w:r>
+        <w:t>Ancient North Eurasian contextual hypothesis. Dashed arrows represent a testable narrative, not evidence that either observed segment followed the illustrated route.</w:t>
+      </w:r>
+    </w:p>
+    <w:p>
+      <w:pPr>
+        <w:spacing w:line="360" w:lineRule="auto" w:after="160"/>
+      </w:pPr>
+      <w:r>
+        <w:rPr>
+          <w:b/>
+        </w:rPr>
+        <w:t xml:space="preserve">Figure S5. </w:t>
+      </w:r>
+      <w:r>
+        <w:t>Descriptive ancient and modern ABO-window summaries generated by different pipelines; no formal temporal comparison is made.</w:t>
+      </w:r>
+    </w:p>
+    <w:p>
+      <w:pPr>
+        <w:spacing w:line="360" w:lineRule="auto" w:after="160"/>
+      </w:pPr>
+      <w:r>
+        <w:rPr>
+          <w:b/>
+        </w:rPr>
+        <w:t xml:space="preserve">Figure S6. </w:t>
+      </w:r>
+      <w:r>
+        <w:t>Literature-derived global context. Circle size represents approximate Neanderthal ancestry and color intensity represents approximate Denisovan ancestry. Values were not used in the pairwise statistical models.</w:t>
       </w:r>
     </w:p>
     <w:sectPr>

</xml_diff>

<commit_message>
Make S2 Minard and S6 bivariate-map figures reproducible from data
Co-Authored-By: Tatsuki Onishi <bougtoir@gmail.com>
</commit_message>
<xml_diff>
--- a/denisovan-archaic-dna-analysis/docs/ajhb_submission/manuscript_ajhb.docx
+++ b/denisovan-archaic-dna-analysis/docs/ajhb_submission/manuscript_ajhb.docx
@@ -538,7 +538,7 @@
           <w:i w:val="0"/>
           <w:sz w:val="24"/>
         </w:rPr>
-        <w:t>Several contextual and schematic displays are provided as supplementary figures because they do not derive from the pairwise analysis. A Minard-style schematic places the analysis within broad dispersal and archaic-introgression contexts, with illustrative band widths and event placement (Figure S2). The O2-defining allele and ABO-window carrier summaries use different sources and are displayed descriptively rather than as an association analysis (Figure S3). An Ancient North Eurasian pathway is retained as a testable contextual hypothesis, not a route inferred from the two Indigenous American segment records (Figure S4). Ancient and modern ABO-window observations were produced by different pipelines and permit no formal temporal comparison (Figure S5). A literature-derived global bivariate map provides broad Neanderthal and Denisovan ancestry context; its approximate values were not used in the statistical models (Figure S6).</w:t>
+        <w:t>Several contextual and schematic displays are provided as supplementary figures because they do not derive from the pairwise analysis. A Minard-style schematic places the analysis within broad dispersal and archaic-introgression contexts, with illustrative band widths and event placement (Figure S2). The O2-defining allele and ABO-window carrier summaries use different sources and are displayed descriptively rather than as an association analysis (Figure S3). An Ancient North Eurasian pathway is retained as a testable contextual hypothesis, not a route inferred from the two Indigenous American segment records (Figure S4). Ancient and modern ABO-window observations were produced by different pipelines and permit no formal temporal comparison (Figure S5). A bivariate global map summarising each population's mean Neanderthal and Denisovan segment coverage from the present profiles provides broad geographic context and was not used in the statistical models (Figure S6).</w:t>
       </w:r>
     </w:p>
     <w:p>
@@ -1138,7 +1138,7 @@
         <w:t xml:space="preserve">Figure S2. </w:t>
       </w:r>
       <w:r>
-        <w:t>Minard-style schematic of human dispersal and archaic introgression. Band widths, branch positions, and event placement are illustrative and do not estimate migration magnitude, ancestry proportion, or a route supported by the present analysis.</w:t>
+        <w:t>Minard-style schematic of human dispersal and archaic introgression. Band widths, branch positions, and event placement are illustrative and do not estimate migration magnitude or a route supported by the present analysis. The ABO sub-lineage compositions shown are computed in this study from data/abo_sublineage_summary.csv (segments, not individuals; ties excluded from the percentages) and the South Asian Denisovan-segment count from data/abo_denisovan_segments.csv; broad archaic-ancestry ranges are attributed on the figure to Prüfer et al. (2014), Vernot and Akey (2014), Reich et al. (2011), and Meyer et al. (2012).</w:t>
       </w:r>
     </w:p>
     <w:p>
@@ -1194,7 +1194,7 @@
         <w:t xml:space="preserve">Figure S6. </w:t>
       </w:r>
       <w:r>
-        <w:t>Literature-derived global context. Circle size represents approximate Neanderthal ancestry and color intensity represents approximate Denisovan ancestry. Values were not used in the pairwise statistical models.</w:t>
+        <w:t>Bivariate global context computed in this study. Circle area encodes the mean per-bin Neanderthal-segment coverage and colour encodes the mean per-bin Denisovan-segment coverage for each population, both from data/population_profiles_500kb.npz; coordinates are approximate sampling locations from data/population_metadata.csv. These descriptive summaries were not used in the pairwise statistical models.</w:t>
       </w:r>
     </w:p>
     <w:sectPr>

</xml_diff>